<commit_message>
Pause menu animation, level building
</commit_message>
<xml_diff>
--- a/Dokumentace_Maturitniho_projektu_Vacula.docx
+++ b/Dokumentace_Maturitniho_projektu_Vacula.docx
@@ -393,49 +393,7 @@
         <w:rPr>
           <w:rStyle w:val="doplnittext"/>
         </w:rPr>
-        <w:t xml:space="preserve">Moje maturitní práce je 2D akční hra </w:t>
-      </w:r>
-      <w:proofErr w:type="spellStart"/>
-      <w:r>
-        <w:rPr>
-          <w:rStyle w:val="doplnittext"/>
-        </w:rPr>
-        <w:t>Lone</w:t>
-      </w:r>
-      <w:proofErr w:type="spellEnd"/>
-      <w:r>
-        <w:rPr>
-          <w:rStyle w:val="doplnittext"/>
-        </w:rPr>
-        <w:t xml:space="preserve"> </w:t>
-      </w:r>
-      <w:proofErr w:type="spellStart"/>
-      <w:r>
-        <w:rPr>
-          <w:rStyle w:val="doplnittext"/>
-        </w:rPr>
-        <w:t>Survivor</w:t>
-      </w:r>
-      <w:proofErr w:type="spellEnd"/>
-      <w:r>
-        <w:rPr>
-          <w:rStyle w:val="doplnittext"/>
-        </w:rPr>
-        <w:t xml:space="preserve">, která je vytvořena v herním </w:t>
-      </w:r>
-      <w:proofErr w:type="spellStart"/>
-      <w:r>
-        <w:rPr>
-          <w:rStyle w:val="doplnittext"/>
-        </w:rPr>
-        <w:t>enginu</w:t>
-      </w:r>
-      <w:proofErr w:type="spellEnd"/>
-      <w:r>
-        <w:rPr>
-          <w:rStyle w:val="doplnittext"/>
-        </w:rPr>
-        <w:t xml:space="preserve"> Godot 4.4. Hra sleduje příběh vojáka, jenž po pádu vrtulníku musí přežít v nepřátelském území plném pastí a ozbrojených protivníků. Cílem projektu je ukázat propojení herního designu, programování a animace v jednotném funkčním celku a vytvořit hratelný prototyp, který demonstruje tvorbu herní logiky, pohybu, boje a interakce s prostředím v moderním vývojovém nástroji.</w:t>
+        <w:t>Moje maturitní práce je 2D akční hra Lone Survivor, která je vytvořena v herním enginu Godot 4.4. Hra sleduje příběh vojáka, jenž po pádu vrtulníku musí přežít v nepřátelském území plném pastí a ozbrojených protivníků. Cílem projektu je ukázat propojení herního designu, programování a animace v jednotném funkčním celku a vytvořit hratelný prototyp, který demonstruje tvorbu herní logiky, pohybu, boje a interakce s prostředím v moderním vývojovém nástroji.</w:t>
       </w:r>
     </w:p>
     <w:p>
@@ -2733,133 +2691,43 @@
       <w:bookmarkStart w:id="9" w:name="_Toc37577534"/>
       <w:bookmarkStart w:id="10" w:name="_Toc37577731"/>
       <w:r>
-        <w:t xml:space="preserve">Herní průmysl se v posledních letech rychle rozvíjí a díky moderním nástrojům dnes může vlastní hru vytvořit i jeden člověk. Jedním z těchto nástrojů je herní </w:t>
-      </w:r>
-      <w:proofErr w:type="spellStart"/>
-      <w:r>
-        <w:t>engine</w:t>
-      </w:r>
-      <w:proofErr w:type="spellEnd"/>
-      <w:r>
-        <w:t xml:space="preserve"> Godot 4.4, který umožňuje poměrně jednoduše vytvářet 2D i 3D hry. Tato maturitní práce se zaměřuje na návrh a vytvoření 2D akční videohry s názvem „</w:t>
-      </w:r>
-      <w:proofErr w:type="spellStart"/>
-      <w:r>
-        <w:t>Lone</w:t>
-      </w:r>
-      <w:proofErr w:type="spellEnd"/>
-      <w:r>
-        <w:t xml:space="preserve"> </w:t>
-      </w:r>
-      <w:proofErr w:type="spellStart"/>
-      <w:r>
-        <w:t>Survivor</w:t>
-      </w:r>
-      <w:proofErr w:type="spellEnd"/>
-      <w:r>
-        <w:t>“.</w:t>
-      </w:r>
-    </w:p>
-    <w:p>
-      <w:r>
-        <w:t xml:space="preserve">Cílem práce bylo vytvořit funkční hru pro operační systém Windows, která kombinuje programování, herní design a vlastní grafiku. Hra je vytvořena v programovacím jazyce </w:t>
-      </w:r>
-      <w:proofErr w:type="spellStart"/>
-      <w:r>
-        <w:t>GDScript</w:t>
-      </w:r>
-      <w:proofErr w:type="spellEnd"/>
-      <w:r>
-        <w:t xml:space="preserve"> a běží v </w:t>
-      </w:r>
-      <w:proofErr w:type="spellStart"/>
-      <w:r>
-        <w:t>enginu</w:t>
-      </w:r>
-      <w:proofErr w:type="spellEnd"/>
-      <w:r>
-        <w:t xml:space="preserve"> Godot. Výsledkem projektu je samostatná aplikace, ve které se hráč snaží přežít v nepřátelském prostředí a postupně projít herní úrovně.</w:t>
-      </w:r>
-    </w:p>
-    <w:p>
-      <w:r>
-        <w:t xml:space="preserve">Grafická stránka hry je vytvořena ve stylu pixel art. Tento styl vychází ze starších videoher, ale i dnes je mezi hráči velmi populární. Pro tvorbu grafiky, například animací postavy nebo prostředí, jsem použil programy </w:t>
-      </w:r>
-      <w:proofErr w:type="spellStart"/>
-      <w:r>
-        <w:t>Pixelorama</w:t>
-      </w:r>
-      <w:proofErr w:type="spellEnd"/>
-      <w:r>
-        <w:t xml:space="preserve"> a Photoshop. Samotná hra byla vytvořena v </w:t>
-      </w:r>
-      <w:proofErr w:type="spellStart"/>
-      <w:r>
-        <w:t>enginu</w:t>
-      </w:r>
-      <w:proofErr w:type="spellEnd"/>
-      <w:r>
-        <w:t xml:space="preserve"> Godot, který umožňuje pracovat s fyzikou, animacemi, logikou hry i uživatelským rozhraním.</w:t>
-      </w:r>
-    </w:p>
-    <w:p>
-      <w:r>
-        <w:t xml:space="preserve">Důležitou částí hry je pohyb postavy a interakce s prostředím. Herní mapy jsou vytvořeny pomocí systému </w:t>
-      </w:r>
-      <w:proofErr w:type="spellStart"/>
-      <w:r>
-        <w:t>TileMap</w:t>
-      </w:r>
-      <w:proofErr w:type="spellEnd"/>
-      <w:r>
-        <w:t xml:space="preserve">, který umožňuje skládat úroveň z menších grafických dlaždic a zároveň nastavit jejich kolize. Hráč se pohybuje v terénu s různými překážkami, kde musí skákat, vyhýbat se nepřátelům a bránit se pomocí střelby. Inspirací pro pohyb a souboje byla hra </w:t>
-      </w:r>
-      <w:proofErr w:type="spellStart"/>
-      <w:r>
-        <w:t>Cactus</w:t>
-      </w:r>
-      <w:proofErr w:type="spellEnd"/>
-      <w:r>
-        <w:t xml:space="preserve"> </w:t>
-      </w:r>
-      <w:proofErr w:type="spellStart"/>
-      <w:r>
-        <w:t>McCoy</w:t>
-      </w:r>
-      <w:proofErr w:type="spellEnd"/>
-      <w:r>
-        <w:t>.</w:t>
-      </w:r>
-    </w:p>
-    <w:p>
-      <w:r>
-        <w:t>Ve hře se nachází také nepřátelé s jednoduchou umělou inteligencí. Ta funguje na principu stavového automatu. Nepřátelé dokážou hráče detekovat pomocí uzlu RayCast2D, který funguje jako neviditelný paprsek představující jejich zorné pole. Pokud paprsek narazí na hráče a není mezi nimi překážka, nepřítel začne útočit. Aby hra nebyla příliš obtížná, obsahuje také systém dobíjení zbraně (</w:t>
-      </w:r>
-      <w:proofErr w:type="spellStart"/>
-      <w:r>
-        <w:t>cooldown</w:t>
-      </w:r>
-      <w:proofErr w:type="spellEnd"/>
-      <w:r>
-        <w:t>), který dává hráči čas reagovat nebo se schovat.</w:t>
-      </w:r>
-    </w:p>
-    <w:p>
-      <w:r>
-        <w:t>Součástí hry je také jednoduché uživatelské rozhraní (GUI), které hráči zobrazuje například stav zdraví. Před dokončením projektu byla hra otestována dvěma nezávislými testery. Jejich zpětná vazba pomohla odhalit některé chyby a upravit obtížnost některých částí hry.</w:t>
-      </w:r>
-    </w:p>
-    <w:p>
-      <w:r>
-        <w:t xml:space="preserve">Práce na tomto projektu mi umožnila lépe pochopit, jak funguje vývoj her. Naučil jsem se pracovat s herním </w:t>
-      </w:r>
-      <w:proofErr w:type="spellStart"/>
-      <w:r>
-        <w:t>enginem</w:t>
-      </w:r>
-      <w:proofErr w:type="spellEnd"/>
-      <w:r>
-        <w:t>, programovat herní logiku a vytvářet vlastní grafiku. Tyto zkušenosti mohou být užitečné pro další studium nebo práci v oblasti informačních technologií.</w:t>
+        <w:t>Herní průmysl se v posledních letech rychle rozvíjí a díky moderním nástrojům dnes může vlastní hru vytvořit i jeden člověk. Jedním z těchto nástrojů je herní engine Godot 4.4, který umožňuje poměrně jednoduše vytvářet 2D i 3D hry. Tato maturitní práce se zaměřuje na návrh a vytvoření 2D akční videohry s názvem „Lone Survivor“.</w:t>
+      </w:r>
+    </w:p>
+    <w:p>
+      <w:r>
+        <w:t>Cílem práce bylo vytvořit funkční hru pro operační systém Windows, která kombinuje programování, herní design a vlastní grafiku. Hra je vytvořena v programovacím jazyce GDScript a běží v enginu Godot. Výsledkem projektu je samostatná aplikace, ve které se hráč snaží přežít v nepřátelském prostředí a postupně projít herní úrovně.</w:t>
+      </w:r>
+    </w:p>
+    <w:p>
+      <w:r>
+        <w:t>Grafická stránka hry je vytvořena ve stylu pixel art. Tento styl vychází ze starších videoher, ale i dnes je mezi hráči velmi populární. Pro tvorbu grafiky, například animací postavy nebo prostředí, jsem použil programy Pixelorama a Photoshop. Samotná hra byla vytvořena v enginu Godot, který umožňuje pracovat s fyzikou, animacemi, logikou hry i uživatelským rozhraním.</w:t>
+      </w:r>
+    </w:p>
+    <w:p>
+      <w:r>
+        <w:t>Důležitou částí hry je pohyb postavy a interakce s prostředím. Herní mapy jsou vytvořeny pomocí systému TileMap, který umožňuje skládat úroveň z menších grafických dlaždic a zároveň nastavit jejich kolize. Hráč se pohybuje v terénu s různými překážkami, kde musí skákat, vyhýbat se nepřátelům a bránit se pomocí střelby. Inspirací pro pohyb a souboje byla hra Cactus McCoy.</w:t>
+      </w:r>
+    </w:p>
+    <w:p>
+      <w:r>
+        <w:t>Ve hře se nachází také nepřátelé s jednoduchou umělou inteligencí. Ta funguje na principu stavového automatu. Nepřátelé dokážou hráče detekovat pomocí uzlu RayCast2D, který funguje jako neviditelný paprsek představující jejich zorné pole. Pokud paprsek narazí na hráče a není mezi nimi překážka, nepřítel začne útočit. Aby hra nebyla příliš obtížná, obsahuje také systém dobíjení zbraně (cooldown), který dává hráči čas reagovat nebo se schovat.</w:t>
+      </w:r>
+    </w:p>
+    <w:p>
+      <w:r>
+        <w:t xml:space="preserve">Součástí hry je také jednoduché uživatelské rozhraní (GUI), které hráči zobrazuje například stav zdraví. Před dokončením projektu byla hra otestována </w:t>
+      </w:r>
+      <w:r>
+        <w:t>několika</w:t>
+      </w:r>
+      <w:r>
+        <w:t xml:space="preserve"> nezávislými testery. Jejich zpětná vazba pomohla odhalit některé chyby a upravit obtížnost některých částí hry.</w:t>
+      </w:r>
+    </w:p>
+    <w:p>
+      <w:r>
+        <w:t>Práce na tomto projektu mi umožnila lépe pochopit, jak funguje vývoj her. Naučil jsem se pracovat s herním enginem, programovat herní logiku a vytvářet vlastní grafiku. Tyto zkušenosti mohou být užitečné pro další studium nebo práci v oblasti informačních technologií.</w:t>
       </w:r>
     </w:p>
     <w:p>
@@ -2928,59 +2796,22 @@
       </w:pPr>
       <w:bookmarkStart w:id="14" w:name="_Toc223976688"/>
       <w:r>
-        <w:t xml:space="preserve">Herní </w:t>
-      </w:r>
-      <w:proofErr w:type="spellStart"/>
-      <w:r>
-        <w:t>Engine</w:t>
-      </w:r>
-      <w:proofErr w:type="spellEnd"/>
-      <w:r>
-        <w:t xml:space="preserve"> - GODOT</w:t>
+        <w:t>Herní Engine - GODOT</w:t>
       </w:r>
       <w:bookmarkEnd w:id="14"/>
     </w:p>
     <w:p>
       <w:r>
-        <w:t>Hra je tvořena v </w:t>
-      </w:r>
-      <w:proofErr w:type="spellStart"/>
-      <w:r>
-        <w:t>Enginu</w:t>
-      </w:r>
-      <w:proofErr w:type="spellEnd"/>
-      <w:r>
-        <w:t xml:space="preserve"> GODOT, který má vlastní vestavěný skriptovací jazyk </w:t>
-      </w:r>
-      <w:proofErr w:type="spellStart"/>
-      <w:r>
-        <w:t>GDScript</w:t>
-      </w:r>
-      <w:proofErr w:type="spellEnd"/>
-      <w:r>
-        <w:t>, který je syntaxí podobný Pythonu.</w:t>
+        <w:t>Hra je tvořena v Enginu GODOT, který má vlastní vestavěný skriptovací jazyk GDScript, který je syntaxí podobný Pythonu.</w:t>
       </w:r>
       <w:r>
         <w:t xml:space="preserve"> </w:t>
       </w:r>
       <w:r>
-        <w:t xml:space="preserve">Při výběru pro mě bylo klíčové, aby mě </w:t>
-      </w:r>
-      <w:proofErr w:type="spellStart"/>
-      <w:r>
-        <w:t>engine</w:t>
-      </w:r>
-      <w:proofErr w:type="spellEnd"/>
-      <w:r>
-        <w:t xml:space="preserve"> nebrzdil, ale naopak mi pomáhal. Godot jsem zvolil hlavně proto, že je to moderní </w:t>
-      </w:r>
-      <w:proofErr w:type="spellStart"/>
-      <w:r>
-        <w:t>engine</w:t>
-      </w:r>
-      <w:proofErr w:type="spellEnd"/>
-      <w:r>
-        <w:t xml:space="preserve"> </w:t>
+        <w:t xml:space="preserve">Při výběru pro mě bylo klíčové, aby mě engine nebrzdil, ale naopak mi pomáhal. Godot jsem zvolil hlavně proto, že je to moderní </w:t>
+      </w:r>
+      <w:r>
+        <w:t xml:space="preserve">engine </w:t>
       </w:r>
       <w:r>
         <w:t xml:space="preserve">s výbornou dokumentací, kde člověk nemusí každou drobnost hodinu </w:t>
@@ -2997,11 +2828,9 @@
       <w:r>
         <w:t xml:space="preserve"> jistotu, že  v budoucnu </w:t>
       </w:r>
-      <w:proofErr w:type="spellStart"/>
       <w:r>
         <w:t>nepříjdou</w:t>
       </w:r>
-      <w:proofErr w:type="spellEnd"/>
       <w:r>
         <w:t xml:space="preserve"> žádné skryté poplatky nebo změny licencí.</w:t>
       </w:r>
@@ -3012,29 +2841,13 @@
       </w:pPr>
       <w:bookmarkStart w:id="15" w:name="_Toc223976689"/>
       <w:r>
-        <w:t xml:space="preserve">Grafika hry - </w:t>
-      </w:r>
-      <w:proofErr w:type="spellStart"/>
-      <w:r>
-        <w:t>Pixelorama</w:t>
-      </w:r>
-      <w:proofErr w:type="spellEnd"/>
-      <w:r>
-        <w:t>/Photoshop</w:t>
+        <w:t>Grafika hry - Pixelorama/Photoshop</w:t>
       </w:r>
       <w:bookmarkEnd w:id="15"/>
     </w:p>
     <w:p>
       <w:r>
-        <w:t>Grafická část hry je tvořená v </w:t>
-      </w:r>
-      <w:proofErr w:type="spellStart"/>
-      <w:r>
-        <w:t>Pixeloramě</w:t>
-      </w:r>
-      <w:proofErr w:type="spellEnd"/>
-      <w:r>
-        <w:t>, což je open-source program pro pixel-art/animace vytvořený v Godotu.</w:t>
+        <w:t>Grafická část hry je tvořená v Pixeloramě, což je open-source program pro pixel-art/animace vytvořený v Godotu.</w:t>
       </w:r>
     </w:p>
     <w:p>
@@ -3087,19 +2900,9 @@
       <w:pPr>
         <w:pStyle w:val="Nadpis4"/>
       </w:pPr>
-      <w:proofErr w:type="spellStart"/>
-      <w:r>
-        <w:t>Cactus</w:t>
-      </w:r>
-      <w:proofErr w:type="spellEnd"/>
-      <w:r>
-        <w:t xml:space="preserve"> </w:t>
-      </w:r>
-      <w:proofErr w:type="spellStart"/>
-      <w:r>
-        <w:t>McCoy</w:t>
-      </w:r>
-      <w:proofErr w:type="spellEnd"/>
+      <w:r>
+        <w:t>Cactus McCoy</w:t>
+      </w:r>
     </w:p>
     <w:p>
       <w:r>
@@ -3108,34 +2911,16 @@
     </w:p>
     <w:p>
       <w:r>
-        <w:t xml:space="preserve">Silné stránky této hry jsou plynulé animace, dynamický soubojový systém, dobře navržené levely. Slabé stránky hry jsou lehká obtížnost pro zkušenější hráče, použité starší technologie (hra byla tvořena pomocí </w:t>
-      </w:r>
-      <w:proofErr w:type="spellStart"/>
-      <w:r>
-        <w:t>Flash</w:t>
-      </w:r>
-      <w:proofErr w:type="spellEnd"/>
-      <w:r>
-        <w:t>).</w:t>
+        <w:t>Silné stránky této hry jsou plynulé animace, dynamický soubojový systém, dobře navržené levely. Slabé stránky hry jsou lehká obtížnost pro zkušenější hráče, použité starší technologie (hra byla tvořena pomocí Flash).</w:t>
       </w:r>
     </w:p>
     <w:p>
       <w:pPr>
         <w:pStyle w:val="Nadpis4"/>
       </w:pPr>
-      <w:proofErr w:type="spellStart"/>
-      <w:r>
-        <w:t>Shovel</w:t>
-      </w:r>
-      <w:proofErr w:type="spellEnd"/>
-      <w:r>
-        <w:t xml:space="preserve"> </w:t>
-      </w:r>
-      <w:proofErr w:type="spellStart"/>
-      <w:r>
-        <w:t>knight</w:t>
-      </w:r>
-      <w:proofErr w:type="spellEnd"/>
+      <w:r>
+        <w:t>Shovel knight</w:t>
+      </w:r>
     </w:p>
     <w:p>
       <w:r>
@@ -3164,15 +2949,7 @@
     </w:p>
     <w:p>
       <w:r>
-        <w:t xml:space="preserve">Analyzované hry jsou postavené na podobném principu. Jedná se o 2D </w:t>
-      </w:r>
-      <w:proofErr w:type="spellStart"/>
-      <w:r>
-        <w:t>plošinovky</w:t>
-      </w:r>
-      <w:proofErr w:type="spellEnd"/>
-      <w:r>
-        <w:t xml:space="preserve"> s bojem proti nepřátelům a postupem úrovněmi. Důraz těchto her je kladen na plynulé ovládání, postupné zvyšování obtížnosti.</w:t>
+        <w:t>Analyzované hry jsou postavené na podobném principu. Jedná se o 2D plošinovky s bojem proti nepřátelům a postupem úrovněmi. Důraz těchto her je kladen na plynulé ovládání, postupné zvyšování obtížnosti.</w:t>
       </w:r>
     </w:p>
     <w:p>
@@ -3193,15 +2970,7 @@
         <w:t xml:space="preserve">V této kapitule </w:t>
       </w:r>
       <w:r>
-        <w:t xml:space="preserve">je popsán návrh herních mechanismů a způsob, jakým je realizována hratelnost s využitím nástrojů </w:t>
-      </w:r>
-      <w:proofErr w:type="spellStart"/>
-      <w:r>
-        <w:t>enginu</w:t>
-      </w:r>
-      <w:proofErr w:type="spellEnd"/>
-      <w:r>
-        <w:t xml:space="preserve"> Godot.</w:t>
+        <w:t>je popsán návrh herních mechanismů a způsob, jakým je realizována hratelnost s využitím nástrojů enginu Godot.</w:t>
       </w:r>
     </w:p>
     <w:p>
@@ -3216,56 +2985,19 @@
     </w:p>
     <w:p>
       <w:r>
-        <w:t xml:space="preserve">Hlavním cílem u pohybu postavy bylo dosáhnout responzivního pohybu postavy, který je pro 2d </w:t>
-      </w:r>
-      <w:proofErr w:type="spellStart"/>
-      <w:r>
-        <w:t>plošinovky</w:t>
-      </w:r>
-      <w:proofErr w:type="spellEnd"/>
-      <w:r>
-        <w:t xml:space="preserve"> důležitý. Cílem bylo dosáhnout toho, aby se postava ovládala příjemně a hráč měl pocit, že má nad postavou plnou kontrolu. </w:t>
+        <w:t xml:space="preserve">Hlavním cílem u pohybu postavy bylo dosáhnout responzivního pohybu postavy, který je pro 2d plošinovky důležitý. Cílem bylo dosáhnout toho, aby se postava ovládala příjemně a hráč měl pocit, že má nad postavou plnou kontrolu. </w:t>
       </w:r>
       <w:r>
         <w:t xml:space="preserve">Pro realizaci jsem využil přednastavené fyzikální metody, které </w:t>
       </w:r>
-      <w:proofErr w:type="spellStart"/>
       <w:r>
         <w:lastRenderedPageBreak/>
-        <w:t>engine</w:t>
-      </w:r>
-      <w:proofErr w:type="spellEnd"/>
-      <w:r>
-        <w:t xml:space="preserve"> nabízí. Klíčovou roli hraje metoda _</w:t>
-      </w:r>
-      <w:proofErr w:type="spellStart"/>
-      <w:r>
-        <w:t>physics_process</w:t>
-      </w:r>
-      <w:proofErr w:type="spellEnd"/>
-      <w:r>
-        <w:t>(delta), která se stará o pravidelné vyhodnocování fyziky nezávisle na snímku hry.</w:t>
-      </w:r>
-    </w:p>
-    <w:p>
-      <w:r>
-        <w:t xml:space="preserve">V rámci této metody jsem využil vestavěnou metodu </w:t>
-      </w:r>
-      <w:proofErr w:type="spellStart"/>
-      <w:r>
-        <w:t>move_and_slide</w:t>
-      </w:r>
-      <w:proofErr w:type="spellEnd"/>
-      <w:r>
-        <w:t>(). Tato metoda je součástí třídy CharacterBody2D a zajišťuje interakci s okolím (např. detekce podlahy). Po využití těchto dvou metod jsem si vytvořil proměnné pro rychlost chůze (SPEED) a délku výskoku, čímž jsem vytvořil základní dynamiku pohybu postavy. Pro úvodní nastavení parametrů po spuštění hry jsem využil metodu _</w:t>
-      </w:r>
-      <w:proofErr w:type="spellStart"/>
-      <w:r>
-        <w:t>ready</w:t>
-      </w:r>
-      <w:proofErr w:type="spellEnd"/>
-      <w:r>
-        <w:t>(), která zajišťuje inicializaci postavy a jejího okolí.</w:t>
+        <w:t>engine nabízí. Klíčovou roli hraje metoda _physics_process(delta), která se stará o pravidelné vyhodnocování fyziky nezávisle na snímku hry.</w:t>
+      </w:r>
+    </w:p>
+    <w:p>
+      <w:r>
+        <w:t>V rámci této metody jsem využil vestavěnou metodu move_and_slide(). Tato metoda je součástí třídy CharacterBody2D a zajišťuje interakci s okolím (např. detekce podlahy). Po využití těchto dvou metod jsem si vytvořil proměnné pro rychlost chůze (SPEED) a délku výskoku, čímž jsem vytvořil základní dynamiku pohybu postavy. Pro úvodní nastavení parametrů po spuštění hry jsem využil metodu _ready(), která zajišťuje inicializaci postavy a jejího okolí.</w:t>
       </w:r>
     </w:p>
     <w:p>
@@ -3343,31 +3075,7 @@
         <w:t xml:space="preserve">: </w:t>
       </w:r>
       <w:r>
-        <w:t>Pro hlavní postavu i nepřátele jsem zvolil třídu CharacterBody2D. Jedná se o předpřipravený herní objekt, který má v </w:t>
-      </w:r>
-      <w:proofErr w:type="spellStart"/>
-      <w:r>
-        <w:t>enginu</w:t>
-      </w:r>
-      <w:proofErr w:type="spellEnd"/>
-      <w:r>
-        <w:t xml:space="preserve"> již </w:t>
-      </w:r>
-      <w:proofErr w:type="spellStart"/>
-      <w:r>
-        <w:t>předprogramované</w:t>
-      </w:r>
-      <w:proofErr w:type="spellEnd"/>
-      <w:r>
-        <w:t xml:space="preserve"> vlastnosti pro pohyb ve 2D prostoru. Klíčová je metoda </w:t>
-      </w:r>
-      <w:proofErr w:type="spellStart"/>
-      <w:r>
-        <w:t>move_and_slide</w:t>
-      </w:r>
-      <w:proofErr w:type="spellEnd"/>
-      <w:r>
-        <w:t>() – Tato metoda řeší detekci kolizí, klouzání podél stěn a pohyb po nakloněných rovinách</w:t>
+        <w:t>Pro hlavní postavu i nepřátele jsem zvolil třídu CharacterBody2D. Jedná se o předpřipravený herní objekt, který má v enginu již předprogramované vlastnosti pro pohyb ve 2D prostoru. Klíčová je metoda move_and_slide() – Tato metoda řeší detekci kolizí, klouzání podél stěn a pohyb po nakloněných rovinách</w:t>
       </w:r>
     </w:p>
     <w:p>
@@ -3390,23 +3098,7 @@
         <w:t xml:space="preserve">RayCast2D: </w:t>
       </w:r>
       <w:r>
-        <w:t xml:space="preserve">Tento uzel funguje jako neviditelná přímka, která je </w:t>
-      </w:r>
-      <w:proofErr w:type="spellStart"/>
-      <w:r>
-        <w:t>vysíláná</w:t>
-      </w:r>
-      <w:proofErr w:type="spellEnd"/>
-      <w:r>
-        <w:t xml:space="preserve"> z bodu A do bodu B. Tato třída se využívá pro účely detekce objektů. Metodu jsem použil pro detekci viditelnosti hráče. Skript přebere informaci, že nepřítel narazil na hráče, další informace jsou popsány ve </w:t>
-      </w:r>
-      <w:proofErr w:type="spellStart"/>
-      <w:r>
-        <w:t>skritpu</w:t>
-      </w:r>
-      <w:proofErr w:type="spellEnd"/>
-      <w:r>
-        <w:t>.</w:t>
+        <w:t>Tento uzel funguje jako neviditelná přímka, která je vysíláná z bodu A do bodu B. Tato třída se využívá pro účely detekce objektů. Metodu jsem použil pro detekci viditelnosti hráče. Skript přebere informaci, že nepřítel narazil na hráče, další informace jsou popsány ve skritpu.</w:t>
       </w:r>
     </w:p>
     <w:p>
@@ -3448,23 +3140,7 @@
     </w:p>
     <w:p>
       <w:r>
-        <w:t>Základem celé hry je metoda _</w:t>
-      </w:r>
-      <w:proofErr w:type="spellStart"/>
-      <w:r>
-        <w:t>physics_process</w:t>
-      </w:r>
-      <w:proofErr w:type="spellEnd"/>
-      <w:r>
-        <w:t xml:space="preserve">(delta). Tato metoda je v frameworku Godot již definována a navržena tak, aby byla </w:t>
-      </w:r>
-      <w:proofErr w:type="spellStart"/>
-      <w:r>
-        <w:t>enginem</w:t>
-      </w:r>
-      <w:proofErr w:type="spellEnd"/>
-      <w:r>
-        <w:t xml:space="preserve"> v pevných časových intervalech volána.</w:t>
+        <w:t>Základem celé hry je metoda _physics_process(delta). Tato metoda je v frameworku Godot již definována a navržena tak, aby byla enginem v pevných časových intervalech volána.</w:t>
       </w:r>
     </w:p>
     <w:p>
@@ -3491,31 +3167,13 @@
       <w:pPr>
         <w:pStyle w:val="Nadpis4"/>
       </w:pPr>
-      <w:proofErr w:type="spellStart"/>
       <w:r>
         <w:t>TileMap</w:t>
       </w:r>
-      <w:proofErr w:type="spellEnd"/>
-    </w:p>
-    <w:p>
-      <w:r>
-        <w:t xml:space="preserve">Pro tvorbu herního světa jsem zvolil systém </w:t>
-      </w:r>
-      <w:proofErr w:type="spellStart"/>
-      <w:r>
-        <w:t>TileMapLayer</w:t>
-      </w:r>
-      <w:proofErr w:type="spellEnd"/>
-      <w:r>
-        <w:t xml:space="preserve">. Tato metoda funguje tak, že rozdělí herní prostředí na pravidelnou mřížku, do které se již vkládají hotové jednotlivé dlaždice (bloky) z předpřipraveného souboru, tzv. </w:t>
-      </w:r>
-      <w:proofErr w:type="spellStart"/>
-      <w:r>
-        <w:t>Tilesetu</w:t>
-      </w:r>
-      <w:proofErr w:type="spellEnd"/>
-      <w:r>
-        <w:t>. Tuto metodu jsem zvolil z těchto dvou hlavních důvodů:</w:t>
+    </w:p>
+    <w:p>
+      <w:r>
+        <w:t>Pro tvorbu herního světa jsem zvolil systém TileMapLayer. Tato metoda funguje tak, že rozdělí herní prostředí na pravidelnou mřížku, do které se již vkládají hotové jednotlivé dlaždice (bloky) z předpřipraveného souboru, tzv. Tilesetu. Tuto metodu jsem zvolil z těchto dvou hlavních důvodů:</w:t>
       </w:r>
     </w:p>
     <w:p>
@@ -3537,27 +3195,9 @@
         </w:rPr>
         <w:t xml:space="preserve">Optimalizace: </w:t>
       </w:r>
-      <w:proofErr w:type="spellStart"/>
-      <w:r>
-        <w:t>Engine</w:t>
-      </w:r>
-      <w:proofErr w:type="spellEnd"/>
-      <w:r>
-        <w:t xml:space="preserve"> vykresluje mapu jako celek, což setří výkon procesoru oproti vkládání </w:t>
-      </w:r>
-      <w:proofErr w:type="spellStart"/>
-      <w:r>
-        <w:t>samosatatných</w:t>
-      </w:r>
-      <w:proofErr w:type="spellEnd"/>
-      <w:r>
-        <w:t xml:space="preserve"> </w:t>
-      </w:r>
-      <w:proofErr w:type="spellStart"/>
-      <w:r>
-        <w:t>obrazků</w:t>
-      </w:r>
-      <w:proofErr w:type="spellEnd"/>
+      <w:r>
+        <w:t>Engine vykresluje mapu jako celek, což setří výkon procesoru oproti vkládání samosatatných obrazků</w:t>
+      </w:r>
     </w:p>
     <w:p>
       <w:pPr>
@@ -3579,31 +3219,7 @@
         <w:t xml:space="preserve">Efektivita: </w:t>
       </w:r>
       <w:r>
-        <w:t xml:space="preserve">V editoru </w:t>
-      </w:r>
-      <w:proofErr w:type="spellStart"/>
-      <w:r>
-        <w:t>Tilesetu</w:t>
-      </w:r>
-      <w:proofErr w:type="spellEnd"/>
-      <w:r>
-        <w:t xml:space="preserve"> jsem každé dlaždici (např. tráva, kámen, plošina) nadefinoval vlastní </w:t>
-      </w:r>
-      <w:proofErr w:type="spellStart"/>
-      <w:r>
-        <w:t>Collison</w:t>
-      </w:r>
-      <w:proofErr w:type="spellEnd"/>
-      <w:r>
-        <w:t xml:space="preserve"> </w:t>
-      </w:r>
-      <w:proofErr w:type="spellStart"/>
-      <w:r>
-        <w:t>Shape</w:t>
-      </w:r>
-      <w:proofErr w:type="spellEnd"/>
-      <w:r>
-        <w:t>. Díky tomu jsem nemusel kolize programovat ručně pro každou část mapy</w:t>
+        <w:t>V editoru Tilesetu jsem každé dlaždici (např. tráva, kámen, plošina) nadefinoval vlastní Collison Shape. Díky tomu jsem nemusel kolize programovat ručně pro každou část mapy</w:t>
       </w:r>
     </w:p>
     <w:p>
@@ -3682,14 +3298,9 @@
         </w:r>
       </w:fldSimple>
       <w:r>
-        <w:t xml:space="preserve"> Použitý </w:t>
-      </w:r>
-      <w:proofErr w:type="spellStart"/>
-      <w:r>
-        <w:t>TileSet</w:t>
+        <w:t xml:space="preserve"> Použitý TileSet</w:t>
       </w:r>
       <w:bookmarkEnd w:id="27"/>
-      <w:proofErr w:type="spellEnd"/>
     </w:p>
     <w:p>
       <w:pPr>
@@ -3715,15 +3326,7 @@
         </w:rPr>
       </w:pPr>
       <w:r>
-        <w:t>Vizuální vrstvy (</w:t>
-      </w:r>
-      <w:proofErr w:type="spellStart"/>
-      <w:r>
-        <w:t>Parallax</w:t>
-      </w:r>
-      <w:proofErr w:type="spellEnd"/>
-      <w:r>
-        <w:t xml:space="preserve"> background)</w:t>
+        <w:t>Vizuální vrstvy (Parallax background)</w:t>
       </w:r>
     </w:p>
     <w:p>
@@ -3747,15 +3350,7 @@
         </w:rPr>
       </w:pPr>
       <w:r>
-        <w:t>Správa prostředků (</w:t>
-      </w:r>
-      <w:proofErr w:type="spellStart"/>
-      <w:r>
-        <w:t>Assets</w:t>
-      </w:r>
-      <w:proofErr w:type="spellEnd"/>
-      <w:r>
-        <w:t>)</w:t>
+        <w:t>Správa prostředků (Assets)</w:t>
       </w:r>
       <w:r>
         <w:rPr>
@@ -3788,31 +3383,7 @@
     </w:p>
     <w:p>
       <w:r>
-        <w:t xml:space="preserve">Hra </w:t>
-      </w:r>
-      <w:proofErr w:type="spellStart"/>
-      <w:r>
-        <w:t>Lone</w:t>
-      </w:r>
-      <w:proofErr w:type="spellEnd"/>
-      <w:r>
-        <w:t xml:space="preserve"> </w:t>
-      </w:r>
-      <w:proofErr w:type="spellStart"/>
-      <w:r>
-        <w:t>Survivor</w:t>
-      </w:r>
-      <w:proofErr w:type="spellEnd"/>
-      <w:r>
-        <w:t xml:space="preserve"> je vytvořená pro operační systém Windows. Hra nevyžaduje </w:t>
-      </w:r>
-      <w:proofErr w:type="spellStart"/>
-      <w:r>
-        <w:t>sloužitou</w:t>
-      </w:r>
-      <w:proofErr w:type="spellEnd"/>
-      <w:r>
-        <w:t xml:space="preserve"> instalaci. Pro spuštění hotového buildu je potřeba dodržet následující kroky:</w:t>
+        <w:t>Hra Lone Survivor je vytvořená pro operační systém Windows. Hra nevyžaduje sloužitou instalaci. Pro spuštění hotového buildu je potřeba dodržet následující kroky:</w:t>
       </w:r>
     </w:p>
     <w:p>
@@ -3824,15 +3395,7 @@
         </w:numPr>
       </w:pPr>
       <w:r>
-        <w:t xml:space="preserve">Build se nachází na oficiálním </w:t>
-      </w:r>
-      <w:proofErr w:type="spellStart"/>
-      <w:r>
-        <w:t>repozitáři</w:t>
-      </w:r>
-      <w:proofErr w:type="spellEnd"/>
-      <w:r>
-        <w:t xml:space="preserve"> projektu na GitHubu: </w:t>
+        <w:t xml:space="preserve">Build se nachází na oficiálním repozitáři projektu na GitHubu: </w:t>
       </w:r>
       <w:hyperlink r:id="rId14" w:history="1">
         <w:r>
@@ -3852,15 +3415,7 @@
         </w:numPr>
       </w:pPr>
       <w:r>
-        <w:t xml:space="preserve">Na GitHubu si otevřete složku </w:t>
-      </w:r>
-      <w:proofErr w:type="spellStart"/>
-      <w:r>
-        <w:t>build_app</w:t>
-      </w:r>
-      <w:proofErr w:type="spellEnd"/>
-      <w:r>
-        <w:t xml:space="preserve"> a stáhněte si celou složku.</w:t>
+        <w:t>Na GitHubu si otevřete složku build_app a stáhněte si celou složku.</w:t>
       </w:r>
     </w:p>
     <w:p>
@@ -3872,23 +3427,7 @@
         </w:numPr>
       </w:pPr>
       <w:r>
-        <w:t>Stažený archiv extrahujte do libovolné složky na počítači (soubor .</w:t>
-      </w:r>
-      <w:proofErr w:type="spellStart"/>
-      <w:r>
-        <w:t>exe</w:t>
-      </w:r>
-      <w:proofErr w:type="spellEnd"/>
-      <w:r>
-        <w:t xml:space="preserve"> musí zůstat ve stejné složce jako soubor .</w:t>
-      </w:r>
-      <w:proofErr w:type="spellStart"/>
-      <w:r>
-        <w:t>pck</w:t>
-      </w:r>
-      <w:proofErr w:type="spellEnd"/>
-      <w:r>
-        <w:t>, který obsahuje veškerá herní data.)</w:t>
+        <w:t>Stažený archiv extrahujte do libovolné složky na počítači (soubor .exe musí zůstat ve stejné složce jako soubor .pck, který obsahuje veškerá herní data.)</w:t>
       </w:r>
     </w:p>
     <w:p>
@@ -3900,15 +3439,7 @@
         </w:numPr>
       </w:pPr>
       <w:r>
-        <w:t xml:space="preserve">Hru spusťte otevřením souboru </w:t>
-      </w:r>
-      <w:proofErr w:type="spellStart"/>
-      <w:r>
-        <w:t>Lone</w:t>
-      </w:r>
-      <w:proofErr w:type="spellEnd"/>
-      <w:r>
-        <w:t xml:space="preserve"> Survivor.exe</w:t>
+        <w:t>Hru spusťte otevřením souboru Lone Survivor.exe</w:t>
       </w:r>
     </w:p>
     <w:p>
@@ -4009,56 +3540,12 @@
         <w:t xml:space="preserve">Odkaz: </w:t>
       </w:r>
       <w:hyperlink r:id="rId15" w:history="1">
-        <w:proofErr w:type="spellStart"/>
         <w:r>
           <w:rPr>
             <w:rStyle w:val="Hypertextovodkaz"/>
           </w:rPr>
-          <w:t>Githubový</w:t>
+          <w:t>Githubový repozitář - Vacula - Lone Survivor</w:t>
         </w:r>
-        <w:proofErr w:type="spellEnd"/>
-        <w:r>
-          <w:rPr>
-            <w:rStyle w:val="Hypertextovodkaz"/>
-          </w:rPr>
-          <w:t xml:space="preserve"> </w:t>
-        </w:r>
-        <w:proofErr w:type="spellStart"/>
-        <w:r>
-          <w:rPr>
-            <w:rStyle w:val="Hypertextovodkaz"/>
-          </w:rPr>
-          <w:t>repozitář</w:t>
-        </w:r>
-        <w:proofErr w:type="spellEnd"/>
-        <w:r>
-          <w:rPr>
-            <w:rStyle w:val="Hypertextovodkaz"/>
-          </w:rPr>
-          <w:t xml:space="preserve"> - Vacula - </w:t>
-        </w:r>
-        <w:proofErr w:type="spellStart"/>
-        <w:r>
-          <w:rPr>
-            <w:rStyle w:val="Hypertextovodkaz"/>
-          </w:rPr>
-          <w:t>Lone</w:t>
-        </w:r>
-        <w:proofErr w:type="spellEnd"/>
-        <w:r>
-          <w:rPr>
-            <w:rStyle w:val="Hypertextovodkaz"/>
-          </w:rPr>
-          <w:t xml:space="preserve"> </w:t>
-        </w:r>
-        <w:proofErr w:type="spellStart"/>
-        <w:r>
-          <w:rPr>
-            <w:rStyle w:val="Hypertextovodkaz"/>
-          </w:rPr>
-          <w:t>Survivor</w:t>
-        </w:r>
-        <w:proofErr w:type="spellEnd"/>
       </w:hyperlink>
     </w:p>
     <w:p>
@@ -4076,47 +3563,7 @@
     </w:p>
     <w:p>
       <w:r>
-        <w:t>Výsledkem této maturitní práce je plně funkční a spustitelná 2D akční videohra s názvem „</w:t>
-      </w:r>
-      <w:proofErr w:type="spellStart"/>
-      <w:r>
-        <w:t>Lone</w:t>
-      </w:r>
-      <w:proofErr w:type="spellEnd"/>
-      <w:r>
-        <w:t xml:space="preserve"> </w:t>
-      </w:r>
-      <w:proofErr w:type="spellStart"/>
-      <w:r>
-        <w:t>Survivor</w:t>
-      </w:r>
-      <w:proofErr w:type="spellEnd"/>
-      <w:r>
-        <w:t xml:space="preserve">“, vytvořená v moderním herním </w:t>
-      </w:r>
-      <w:proofErr w:type="spellStart"/>
-      <w:r>
-        <w:t>engine</w:t>
-      </w:r>
-      <w:proofErr w:type="spellEnd"/>
-      <w:r>
-        <w:t xml:space="preserve"> Godot 4.4. Jedná se o titul žánru „</w:t>
-      </w:r>
-      <w:proofErr w:type="spellStart"/>
-      <w:r>
-        <w:t>platformer</w:t>
-      </w:r>
-      <w:proofErr w:type="spellEnd"/>
-      <w:r>
-        <w:t xml:space="preserve">“, který kombinuje mechaniky pohybu v terénu s akčním soubojovým systémem. Hra obsahuje kompletní herní smyčku, animace postav vytvořené v softwaru </w:t>
-      </w:r>
-      <w:proofErr w:type="spellStart"/>
-      <w:r>
-        <w:t>Pixelorama</w:t>
-      </w:r>
-      <w:proofErr w:type="spellEnd"/>
-      <w:r>
-        <w:t xml:space="preserve"> a Photoshop a inteligentní protivníky. Po technické stránce produkt využívá objektově orientovanou architekturu, implementuje dynamickou detekci kolizí a umělou inteligenci nepřátel, která reaguje na přítomnost hráče v reálném čase</w:t>
+        <w:t>Výsledkem této maturitní práce je plně funkční a spustitelná 2D akční videohra s názvem „Lone Survivor“, vytvořená v moderním herním engine Godot 4.4. Jedná se o titul žánru „platformer“, který kombinuje mechaniky pohybu v terénu s akčním soubojovým systémem. Hra obsahuje kompletní herní smyčku, animace postav vytvořené v softwaru Pixelorama a Photoshop a inteligentní protivníky. Po technické stránce produkt využívá objektově orientovanou architekturu, implementuje dynamickou detekci kolizí a umělou inteligenci nepřátel, která reaguje na přítomnost hráče v reálném čase</w:t>
       </w:r>
       <w:r>
         <w:t>.</w:t>
@@ -4129,28 +3576,12 @@
     </w:p>
     <w:p>
       <w:r>
-        <w:t xml:space="preserve">Během práce na projektu jsem učinil několik důležitých technických rozhodnutí. Jedno z klíčových rozhodnutí, byla volba správné třídy pro fyziku postav, k čemuž jsem využil metodu CharacterBody2D, která s vestavěnou metodou </w:t>
-      </w:r>
-      <w:proofErr w:type="spellStart"/>
-      <w:r>
-        <w:t>move_and_slide</w:t>
-      </w:r>
-      <w:proofErr w:type="spellEnd"/>
-      <w:r>
-        <w:t>() zajistila stabilitu kolizí a plynulý pohyb po šikmých plochách. Toto rozhodnutí odstranilo problémy s propadáváním texturami a zasekávaní mezi objekty.</w:t>
-      </w:r>
-    </w:p>
-    <w:p>
-      <w:r>
-        <w:t>Produkt splnil všechna původní očekávání. Hra obsahuje jak všechny plánované prvky, jako je boj a interakce s </w:t>
-      </w:r>
-      <w:proofErr w:type="spellStart"/>
-      <w:r>
-        <w:t>TileMapou</w:t>
-      </w:r>
-      <w:proofErr w:type="spellEnd"/>
-      <w:r>
-        <w:t>, ale podařilo se mi i vytvořit funkční a plynulé animace, což nebylo v zadání plánováno.</w:t>
+        <w:t>Během práce na projektu jsem učinil několik důležitých technických rozhodnutí. Jedno z klíčových rozhodnutí, byla volba správné třídy pro fyziku postav, k čemuž jsem využil metodu CharacterBody2D, která s vestavěnou metodou move_and_slide() zajistila stabilitu kolizí a plynulý pohyb po šikmých plochách. Toto rozhodnutí odstranilo problémy s propadáváním texturami a zasekávaní mezi objekty.</w:t>
+      </w:r>
+    </w:p>
+    <w:p>
+      <w:r>
+        <w:t>Produkt splnil všechna původní očekávání. Hra obsahuje jak všechny plánované prvky, jako je boj a interakce s TileMapou, ale podařilo se mi i vytvořit funkční a plynulé animace, což nebylo v zadání plánováno.</w:t>
       </w:r>
     </w:p>
     <w:p>
@@ -4182,53 +3613,12 @@
       <w:r>
         <w:t>. </w:t>
       </w:r>
-      <w:proofErr w:type="spellStart"/>
       <w:r>
         <w:rPr>
           <w:i/>
           <w:iCs/>
         </w:rPr>
-        <w:t>How</w:t>
-      </w:r>
-      <w:proofErr w:type="spellEnd"/>
-      <w:r>
-        <w:rPr>
-          <w:i/>
-          <w:iCs/>
-        </w:rPr>
-        <w:t xml:space="preserve"> to Use </w:t>
-      </w:r>
-      <w:proofErr w:type="spellStart"/>
-      <w:r>
-        <w:rPr>
-          <w:i/>
-          <w:iCs/>
-        </w:rPr>
-        <w:t>the</w:t>
-      </w:r>
-      <w:proofErr w:type="spellEnd"/>
-      <w:r>
-        <w:rPr>
-          <w:i/>
-          <w:iCs/>
-        </w:rPr>
-        <w:t xml:space="preserve"> New </w:t>
-      </w:r>
-      <w:proofErr w:type="spellStart"/>
-      <w:r>
-        <w:rPr>
-          <w:i/>
-          <w:iCs/>
-        </w:rPr>
-        <w:t>TileMap</w:t>
-      </w:r>
-      <w:proofErr w:type="spellEnd"/>
-      <w:r>
-        <w:rPr>
-          <w:i/>
-          <w:iCs/>
-        </w:rPr>
-        <w:t xml:space="preserve"> in Godot 4</w:t>
+        <w:t>How to Use the New TileMap in Godot 4</w:t>
       </w:r>
       <w:r>
         <w:t>. Online. 2022. Dostupné z: </w:t>
@@ -4257,17 +3647,8 @@
           <w:i/>
           <w:iCs/>
         </w:rPr>
-        <w:t xml:space="preserve">Godot </w:t>
-      </w:r>
-      <w:proofErr w:type="spellStart"/>
-      <w:r>
-        <w:rPr>
-          <w:i/>
-          <w:iCs/>
-        </w:rPr>
-        <w:t>Docs</w:t>
-      </w:r>
-      <w:proofErr w:type="spellEnd"/>
+        <w:t>Godot Docs</w:t>
+      </w:r>
       <w:r>
         <w:t>. Online. © Copyright 2014-present. Dostupné z: </w:t>
       </w:r>
@@ -4290,31 +3671,13 @@
       <w:r>
         <w:t>LINIETSKY, Juan; MANZUR, Ariel a GODOT COMMUNITY. </w:t>
       </w:r>
-      <w:proofErr w:type="spellStart"/>
       <w:r>
         <w:rPr>
           <w:i/>
           <w:iCs/>
         </w:rPr>
-        <w:t>Documentation</w:t>
-      </w:r>
-      <w:proofErr w:type="spellEnd"/>
-      <w:r>
-        <w:rPr>
-          <w:i/>
-          <w:iCs/>
-        </w:rPr>
-        <w:t xml:space="preserve"> 2D </w:t>
-      </w:r>
-      <w:proofErr w:type="spellStart"/>
-      <w:r>
-        <w:rPr>
-          <w:i/>
-          <w:iCs/>
-        </w:rPr>
-        <w:t>tutorials</w:t>
-      </w:r>
-      <w:proofErr w:type="spellEnd"/>
+        <w:t>Documentation 2D tutorials</w:t>
+      </w:r>
       <w:r>
         <w:t>. Online. 2014. Dostupné z: </w:t>
       </w:r>
@@ -4337,47 +3700,13 @@
       <w:r>
         <w:t>SAULTOONS. </w:t>
       </w:r>
-      <w:proofErr w:type="spellStart"/>
       <w:r>
         <w:rPr>
           <w:i/>
           <w:iCs/>
         </w:rPr>
-        <w:t>The</w:t>
-      </w:r>
-      <w:proofErr w:type="spellEnd"/>
-      <w:r>
-        <w:rPr>
-          <w:i/>
-          <w:iCs/>
-        </w:rPr>
-        <w:t xml:space="preserve"> </w:t>
-      </w:r>
-      <w:proofErr w:type="spellStart"/>
-      <w:r>
-        <w:rPr>
-          <w:i/>
-          <w:iCs/>
-        </w:rPr>
-        <w:t>Ultimate</w:t>
-      </w:r>
-      <w:proofErr w:type="spellEnd"/>
-      <w:r>
-        <w:rPr>
-          <w:i/>
-          <w:iCs/>
-        </w:rPr>
-        <w:t xml:space="preserve"> Pixel Art </w:t>
-      </w:r>
-      <w:proofErr w:type="spellStart"/>
-      <w:r>
-        <w:rPr>
-          <w:i/>
-          <w:iCs/>
-        </w:rPr>
-        <w:t>Tutorial</w:t>
-      </w:r>
-      <w:proofErr w:type="spellEnd"/>
+        <w:t>The Ultimate Pixel Art Tutorial</w:t>
+      </w:r>
       <w:r>
         <w:t>. Online. 2021. Dostupné z: </w:t>
       </w:r>
@@ -6549,6 +5878,7 @@
   <w:style w:type="character" w:default="1" w:styleId="Standardnpsmoodstavce">
     <w:name w:val="Default Paragraph Font"/>
     <w:uiPriority w:val="1"/>
+    <w:semiHidden/>
     <w:unhideWhenUsed/>
   </w:style>
   <w:style w:type="table" w:default="1" w:styleId="Normlntabulka">

</xml_diff>